<commit_message>
feat: update Legal Complaint template
</commit_message>
<xml_diff>
--- a/templates/Legal Complaint - Template.docx
+++ b/templates/Legal Complaint - Template.docx
@@ -4566,27 +4566,7 @@
           <w:sz w:val="24"/>
           <w:szCs w:val="24"/>
         </w:rPr>
-        <w:t xml:space="preserve">duly performed </w:t>
-      </w:r>
-      <w:proofErr w:type="gramStart"/>
-      <w:r>
-        <w:rPr>
-          <w:rFonts w:ascii="Times New Roman" w:hAnsi="Times New Roman"/>
-          <w:color w:val="000000" w:themeColor="text1"/>
-          <w:sz w:val="24"/>
-          <w:szCs w:val="24"/>
-        </w:rPr>
-        <w:t>all of</w:t>
-      </w:r>
-      <w:proofErr w:type="gramEnd"/>
-      <w:r>
-        <w:rPr>
-          <w:rFonts w:ascii="Times New Roman" w:hAnsi="Times New Roman"/>
-          <w:color w:val="000000" w:themeColor="text1"/>
-          <w:sz w:val="24"/>
-          <w:szCs w:val="24"/>
-        </w:rPr>
-        <w:t xml:space="preserve"> the conditions of </w:t>
+        <w:t xml:space="preserve">duly performed all of the conditions of </w:t>
       </w:r>
       <w:r>
         <w:rPr>
@@ -5091,25 +5071,7 @@
           <w:sz w:val="24"/>
           <w:szCs w:val="24"/>
         </w:rPr>
-        <w:t xml:space="preserve">, and </w:t>
-      </w:r>
-      <w:proofErr w:type="gramStart"/>
-      <w:r>
-        <w:rPr>
-          <w:rFonts w:ascii="Times New Roman" w:hAnsi="Times New Roman"/>
-          <w:sz w:val="24"/>
-          <w:szCs w:val="24"/>
-        </w:rPr>
-        <w:t>at all times</w:t>
-      </w:r>
-      <w:proofErr w:type="gramEnd"/>
-      <w:r>
-        <w:rPr>
-          <w:rFonts w:ascii="Times New Roman" w:hAnsi="Times New Roman"/>
-          <w:sz w:val="24"/>
-          <w:szCs w:val="24"/>
-        </w:rPr>
-        <w:t xml:space="preserve"> relevant</w:t>
+        <w:t>, and at all times relevant</w:t>
       </w:r>
       <w:r>
         <w:rPr>
@@ -6423,27 +6385,7 @@
           <w:sz w:val="24"/>
           <w:szCs w:val="24"/>
         </w:rPr>
-        <w:t xml:space="preserve">is a person who, </w:t>
-      </w:r>
-      <w:proofErr w:type="gramStart"/>
-      <w:r>
-        <w:rPr>
-          <w:rFonts w:ascii="Times New Roman" w:hAnsi="Times New Roman"/>
-          <w:color w:val="000000" w:themeColor="text1"/>
-          <w:sz w:val="24"/>
-          <w:szCs w:val="24"/>
-        </w:rPr>
-        <w:t>at all times</w:t>
-      </w:r>
-      <w:proofErr w:type="gramEnd"/>
-      <w:r>
-        <w:rPr>
-          <w:rFonts w:ascii="Times New Roman" w:hAnsi="Times New Roman"/>
-          <w:color w:val="000000" w:themeColor="text1"/>
-          <w:sz w:val="24"/>
-          <w:szCs w:val="24"/>
-        </w:rPr>
-        <w:t xml:space="preserve"> relevant to this action, </w:t>
+        <w:t xml:space="preserve">is a person who, at all times relevant to this action, </w:t>
       </w:r>
       <w:r>
         <w:rPr>
@@ -7987,36 +7929,16 @@
           <w:sz w:val="24"/>
           <w:szCs w:val="24"/>
         </w:rPr>
-        <w:t xml:space="preserve">Additionally, </w:t>
-      </w:r>
-      <w:proofErr w:type="gramStart"/>
-      <w:r>
-        <w:rPr>
-          <w:rFonts w:ascii="Times New Roman" w:hAnsi="Times New Roman"/>
-          <w:color w:val="000000" w:themeColor="text1"/>
-          <w:sz w:val="24"/>
-          <w:szCs w:val="24"/>
-        </w:rPr>
-        <w:t>a</w:t>
-      </w:r>
-      <w:r>
-        <w:rPr>
-          <w:rFonts w:ascii="Times New Roman" w:hAnsi="Times New Roman"/>
-          <w:color w:val="000000" w:themeColor="text1"/>
-          <w:sz w:val="24"/>
-          <w:szCs w:val="24"/>
-        </w:rPr>
-        <w:t>t all times</w:t>
-      </w:r>
-      <w:proofErr w:type="gramEnd"/>
-      <w:r>
-        <w:rPr>
-          <w:rFonts w:ascii="Times New Roman" w:hAnsi="Times New Roman"/>
-          <w:color w:val="000000" w:themeColor="text1"/>
-          <w:sz w:val="24"/>
-          <w:szCs w:val="24"/>
-        </w:rPr>
-        <w:t xml:space="preserve"> relevant herein, </w:t>
+        <w:t>Additionally, a</w:t>
+      </w:r>
+      <w:r>
+        <w:rPr>
+          <w:rFonts w:ascii="Times New Roman" w:hAnsi="Times New Roman"/>
+          <w:color w:val="000000" w:themeColor="text1"/>
+          <w:sz w:val="24"/>
+          <w:szCs w:val="24"/>
+        </w:rPr>
+        <w:t xml:space="preserve">t all times relevant herein, </w:t>
       </w:r>
       <w:r>
         <w:rPr>
@@ -8120,27 +8042,7 @@
           <w:sz w:val="24"/>
           <w:szCs w:val="24"/>
         </w:rPr>
-        <w:t xml:space="preserve">, and each of them, are and </w:t>
-      </w:r>
-      <w:proofErr w:type="gramStart"/>
-      <w:r>
-        <w:rPr>
-          <w:rFonts w:ascii="Times New Roman" w:hAnsi="Times New Roman"/>
-          <w:color w:val="000000" w:themeColor="text1"/>
-          <w:sz w:val="24"/>
-          <w:szCs w:val="24"/>
-        </w:rPr>
-        <w:t>were at all times</w:t>
-      </w:r>
-      <w:proofErr w:type="gramEnd"/>
-      <w:r>
-        <w:rPr>
-          <w:rFonts w:ascii="Times New Roman" w:hAnsi="Times New Roman"/>
-          <w:color w:val="000000" w:themeColor="text1"/>
-          <w:sz w:val="24"/>
-          <w:szCs w:val="24"/>
-        </w:rPr>
-        <w:t xml:space="preserve"> relevant to this action, in the business of owning, renting, controlling, possessing, leasing, managing, and/or maintaining residential dwelling units in the </w:t>
+        <w:t xml:space="preserve">, and each of them, are and were at all times relevant to this action, in the business of owning, renting, controlling, possessing, leasing, managing, and/or maintaining residential dwelling units in the </w:t>
       </w:r>
       <w:r>
         <w:rPr>
@@ -10070,17 +9972,7 @@
           <w:sz w:val="24"/>
           <w:szCs w:val="24"/>
         </w:rPr>
-        <w:t xml:space="preserve"> attorney leave the </w:t>
-      </w:r>
-      <w:proofErr w:type="gramStart"/>
-      <w:r>
-        <w:rPr>
-          <w:rFonts w:ascii="Times New Roman" w:hAnsi="Times New Roman"/>
-          <w:color w:val="000000" w:themeColor="text1"/>
-          <w:sz w:val="24"/>
-          <w:szCs w:val="24"/>
-        </w:rPr>
-        <w:t>P</w:t>
+        <w:t xml:space="preserve"> attorney leave the P</w:t>
       </w:r>
       <w:r>
         <w:rPr>
@@ -10098,17 +9990,7 @@
           <w:sz w:val="24"/>
           <w:szCs w:val="24"/>
         </w:rPr>
-        <w:t>,</w:t>
-      </w:r>
-      <w:proofErr w:type="gramEnd"/>
-      <w:r>
-        <w:rPr>
-          <w:rFonts w:ascii="Times New Roman" w:hAnsi="Times New Roman"/>
-          <w:color w:val="000000" w:themeColor="text1"/>
-          <w:sz w:val="24"/>
-          <w:szCs w:val="24"/>
-        </w:rPr>
-        <w:t xml:space="preserve"> they were</w:t>
+        <w:t>, they were</w:t>
       </w:r>
       <w:r>
         <w:rPr>
@@ -10408,27 +10290,7 @@
           <w:sz w:val="24"/>
           <w:szCs w:val="24"/>
         </w:rPr>
-        <w:t xml:space="preserve">In this </w:t>
-      </w:r>
-      <w:proofErr w:type="gramStart"/>
-      <w:r>
-        <w:rPr>
-          <w:rFonts w:ascii="Times New Roman" w:hAnsi="Times New Roman"/>
-          <w:color w:val="000000" w:themeColor="text1"/>
-          <w:sz w:val="24"/>
-          <w:szCs w:val="24"/>
-        </w:rPr>
-        <w:t>particular case</w:t>
-      </w:r>
-      <w:proofErr w:type="gramEnd"/>
-      <w:r>
-        <w:rPr>
-          <w:rFonts w:ascii="Times New Roman" w:hAnsi="Times New Roman"/>
-          <w:color w:val="000000" w:themeColor="text1"/>
-          <w:sz w:val="24"/>
-          <w:szCs w:val="24"/>
-        </w:rPr>
-        <w:t>, none of the exceptions set forth in th</w:t>
+        <w:t>In this particular case, none of the exceptions set forth in th</w:t>
       </w:r>
       <w:r>
         <w:rPr>
@@ -11286,25 +11148,7 @@
           <w:sz w:val="24"/>
           <w:szCs w:val="24"/>
         </w:rPr>
-        <w:t xml:space="preserve">However, as reflected in PLAINTIFF’s written response, the objection has never been to temporarily </w:t>
-      </w:r>
-      <w:proofErr w:type="gramStart"/>
-      <w:r>
-        <w:rPr>
-          <w:rFonts w:ascii="Times New Roman" w:hAnsi="Times New Roman"/>
-          <w:sz w:val="24"/>
-          <w:szCs w:val="24"/>
-        </w:rPr>
-        <w:t>vacating</w:t>
-      </w:r>
-      <w:proofErr w:type="gramEnd"/>
-      <w:r>
-        <w:rPr>
-          <w:rFonts w:ascii="Times New Roman" w:hAnsi="Times New Roman"/>
-          <w:sz w:val="24"/>
-          <w:szCs w:val="24"/>
-        </w:rPr>
-        <w:t xml:space="preserve"> the PROPERTY, but the unreasonable conditions under which such relocation was proposed</w:t>
+        <w:t>However, as reflected in PLAINTIFF’s written response, the objection has never been to temporarily vacating the PROPERTY, but the unreasonable conditions under which such relocation was proposed</w:t>
       </w:r>
       <w:r>
         <w:rPr>
@@ -11982,25 +11826,7 @@
           <w:sz w:val="24"/>
           <w:szCs w:val="24"/>
         </w:rPr>
-        <w:t xml:space="preserve"> minor daughter </w:t>
-      </w:r>
-      <w:proofErr w:type="gramStart"/>
-      <w:r>
-        <w:rPr>
-          <w:rFonts w:ascii="Times New Roman" w:hAnsi="Times New Roman"/>
-          <w:sz w:val="24"/>
-          <w:szCs w:val="24"/>
-        </w:rPr>
-        <w:t>have</w:t>
-      </w:r>
-      <w:proofErr w:type="gramEnd"/>
-      <w:r>
-        <w:rPr>
-          <w:rFonts w:ascii="Times New Roman" w:hAnsi="Times New Roman"/>
-          <w:sz w:val="24"/>
-          <w:szCs w:val="24"/>
-        </w:rPr>
-        <w:t xml:space="preserve"> injured their ankles after stepping into them. In some sections, the flooring was completely removed and has not been replaced, nor has any temporary measure been provided, representing a serious safety hazard to P</w:t>
+        <w:t xml:space="preserve"> minor daughter have injured their ankles after stepping into them. In some sections, the flooring was completely removed and has not been replaced, nor has any temporary measure been provided, representing a serious safety hazard to P</w:t>
       </w:r>
       <w:r>
         <w:rPr>
@@ -12272,25 +12098,7 @@
           <w:sz w:val="24"/>
           <w:szCs w:val="24"/>
         </w:rPr>
-        <w:t xml:space="preserve">Additionally, according to the </w:t>
-      </w:r>
-      <w:proofErr w:type="gramStart"/>
-      <w:r>
-        <w:rPr>
-          <w:rFonts w:ascii="Times New Roman" w:hAnsi="Times New Roman"/>
-          <w:sz w:val="24"/>
-          <w:szCs w:val="24"/>
-        </w:rPr>
-        <w:t>aforementioned inspection</w:t>
-      </w:r>
-      <w:proofErr w:type="gramEnd"/>
-      <w:r>
-        <w:rPr>
-          <w:rFonts w:ascii="Times New Roman" w:hAnsi="Times New Roman"/>
-          <w:sz w:val="24"/>
-          <w:szCs w:val="24"/>
-        </w:rPr>
-        <w:t>, the electrical panel poses a fire hazard. The type of panel installed at the P</w:t>
+        <w:t>Additionally, according to the aforementioned inspection, the electrical panel poses a fire hazard. The type of panel installed at the P</w:t>
       </w:r>
       <w:r>
         <w:rPr>
@@ -12983,25 +12791,7 @@
           <w:sz w:val="24"/>
           <w:szCs w:val="24"/>
         </w:rPr>
-        <w:t xml:space="preserve">, spreading </w:t>
-      </w:r>
-      <w:proofErr w:type="gramStart"/>
-      <w:r>
-        <w:rPr>
-          <w:rFonts w:ascii="Times New Roman" w:hAnsi="Times New Roman"/>
-          <w:sz w:val="24"/>
-          <w:szCs w:val="24"/>
-        </w:rPr>
-        <w:t>more and more</w:t>
-      </w:r>
-      <w:proofErr w:type="gramEnd"/>
-      <w:r>
-        <w:rPr>
-          <w:rFonts w:ascii="Times New Roman" w:hAnsi="Times New Roman"/>
-          <w:sz w:val="24"/>
-          <w:szCs w:val="24"/>
-        </w:rPr>
-        <w:t xml:space="preserve">, as the root cause </w:t>
+        <w:t xml:space="preserve">, spreading more and more, as the root cause </w:t>
       </w:r>
       <w:r>
         <w:rPr>
@@ -16084,21 +15874,7 @@
         <w:rPr>
           <w:szCs w:val="24"/>
         </w:rPr>
-        <w:t xml:space="preserve">For temporary, preliminary, and permanent injunctive relief restraining and enjoining Defendants, their managers, servants, agents, officers, employees, and all other persons acting on their behalf and/or at their direction, from violating </w:t>
-      </w:r>
-      <w:proofErr w:type="gramStart"/>
-      <w:r>
-        <w:rPr>
-          <w:szCs w:val="24"/>
-        </w:rPr>
-        <w:t>any and all</w:t>
-      </w:r>
-      <w:proofErr w:type="gramEnd"/>
-      <w:r>
-        <w:rPr>
-          <w:szCs w:val="24"/>
-        </w:rPr>
-        <w:t xml:space="preserve"> applicable codes, ordinances, regulations</w:t>
+        <w:t>For temporary, preliminary, and permanent injunctive relief restraining and enjoining Defendants, their managers, servants, agents, officers, employees, and all other persons acting on their behalf and/or at their direction, from violating any and all applicable codes, ordinances, regulations</w:t>
       </w:r>
       <w:r>
         <w:rPr>
@@ -16110,16 +15886,8 @@
         <w:rPr>
           <w:szCs w:val="24"/>
         </w:rPr>
-        <w:t xml:space="preserve"> and </w:t>
-      </w:r>
-      <w:proofErr w:type="gramStart"/>
-      <w:r>
-        <w:rPr>
-          <w:szCs w:val="24"/>
-        </w:rPr>
-        <w:t>laws;</w:t>
-      </w:r>
-      <w:proofErr w:type="gramEnd"/>
+        <w:t xml:space="preserve"> and laws;</w:t>
+      </w:r>
     </w:p>
     <w:p>
       <w:pPr>
@@ -16155,16 +15923,8 @@
         <w:rPr>
           <w:szCs w:val="24"/>
         </w:rPr>
-        <w:t xml:space="preserve"> and that Defendants are not entitled to take the annual general rent increase pursuant </w:t>
-      </w:r>
-      <w:proofErr w:type="gramStart"/>
-      <w:r>
-        <w:rPr>
-          <w:szCs w:val="24"/>
-        </w:rPr>
-        <w:t>thereto;</w:t>
-      </w:r>
-      <w:proofErr w:type="gramEnd"/>
+        <w:t xml:space="preserve"> and that Defendants are not entitled to take the annual general rent increase pursuant thereto;</w:t>
+      </w:r>
     </w:p>
     <w:p>
       <w:pPr>
@@ -16194,16 +15954,8 @@
         <w:rPr>
           <w:szCs w:val="24"/>
         </w:rPr>
-        <w:t xml:space="preserve">eneral damages, according to </w:t>
-      </w:r>
-      <w:proofErr w:type="gramStart"/>
-      <w:r>
-        <w:rPr>
-          <w:szCs w:val="24"/>
-        </w:rPr>
-        <w:t>proof;</w:t>
-      </w:r>
-      <w:proofErr w:type="gramEnd"/>
+        <w:t>eneral damages, according to proof;</w:t>
+      </w:r>
     </w:p>
     <w:p>
       <w:pPr>
@@ -16233,21 +15985,7 @@
         <w:rPr>
           <w:szCs w:val="24"/>
         </w:rPr>
-        <w:t xml:space="preserve">rder that the present owners refund any rents collected during the </w:t>
-      </w:r>
-      <w:proofErr w:type="gramStart"/>
-      <w:r>
-        <w:rPr>
-          <w:szCs w:val="24"/>
-        </w:rPr>
-        <w:t>period of time</w:t>
-      </w:r>
-      <w:proofErr w:type="gramEnd"/>
-      <w:r>
-        <w:rPr>
-          <w:szCs w:val="24"/>
-        </w:rPr>
-        <w:t xml:space="preserve"> when the owners </w:t>
+        <w:t xml:space="preserve">rder that the present owners refund any rents collected during the period of time when the owners </w:t>
       </w:r>
       <w:r>
         <w:rPr>
@@ -16291,30 +16029,8 @@
         <w:rPr>
           <w:szCs w:val="24"/>
         </w:rPr>
-        <w:t xml:space="preserve"> any rent increases imposed during this period and refund any rent collected </w:t>
-      </w:r>
-      <w:proofErr w:type="gramStart"/>
-      <w:r>
-        <w:rPr>
-          <w:szCs w:val="24"/>
-        </w:rPr>
-        <w:t>as a result of</w:t>
-      </w:r>
-      <w:proofErr w:type="gramEnd"/>
-      <w:r>
-        <w:rPr>
-          <w:szCs w:val="24"/>
-        </w:rPr>
-        <w:t xml:space="preserve"> these unlawful rent </w:t>
-      </w:r>
-      <w:proofErr w:type="gramStart"/>
-      <w:r>
-        <w:rPr>
-          <w:szCs w:val="24"/>
-        </w:rPr>
-        <w:t>increases;</w:t>
-      </w:r>
-      <w:proofErr w:type="gramEnd"/>
+        <w:t xml:space="preserve"> any rent increases imposed during this period and refund any rent collected as a result of these unlawful rent increases;</w:t>
+      </w:r>
     </w:p>
     <w:p>
       <w:pPr>
@@ -16344,16 +16060,8 @@
         <w:rPr>
           <w:szCs w:val="24"/>
         </w:rPr>
-        <w:t xml:space="preserve"> 1940.2 and </w:t>
-      </w:r>
-      <w:proofErr w:type="gramStart"/>
-      <w:r>
-        <w:rPr>
-          <w:szCs w:val="24"/>
-        </w:rPr>
-        <w:t>1942.5;</w:t>
-      </w:r>
-      <w:proofErr w:type="gramEnd"/>
+        <w:t xml:space="preserve"> 1940.2 and 1942.5;</w:t>
+      </w:r>
     </w:p>
     <w:p>
       <w:pPr>
@@ -16371,16 +16079,8 @@
         <w:rPr>
           <w:szCs w:val="24"/>
         </w:rPr>
-        <w:t xml:space="preserve">For compensatory and actual damages, including a retroactive rent abatement, in an amount to be proven at </w:t>
-      </w:r>
-      <w:proofErr w:type="gramStart"/>
-      <w:r>
-        <w:rPr>
-          <w:szCs w:val="24"/>
-        </w:rPr>
-        <w:t>trial;</w:t>
-      </w:r>
-      <w:proofErr w:type="gramEnd"/>
+        <w:t>For compensatory and actual damages, including a retroactive rent abatement, in an amount to be proven at trial;</w:t>
+      </w:r>
     </w:p>
     <w:p>
       <w:pPr>
@@ -16440,21 +16140,7 @@
         <w:rPr>
           <w:szCs w:val="24"/>
         </w:rPr>
-        <w:t xml:space="preserve"> unlawful conduct, in an amount according to proof at </w:t>
-      </w:r>
-      <w:proofErr w:type="gramStart"/>
-      <w:r>
-        <w:rPr>
-          <w:szCs w:val="24"/>
-        </w:rPr>
-        <w:t>trial;</w:t>
-      </w:r>
-      <w:proofErr w:type="gramEnd"/>
-      <w:r>
-        <w:rPr>
-          <w:szCs w:val="24"/>
-        </w:rPr>
-        <w:t xml:space="preserve"> </w:t>
+        <w:t xml:space="preserve"> unlawful conduct, in an amount according to proof at trial; </w:t>
       </w:r>
     </w:p>
     <w:p>
@@ -16473,16 +16159,8 @@
         <w:rPr>
           <w:szCs w:val="24"/>
         </w:rPr>
-        <w:t xml:space="preserve">For punitive and exemplary damages based on Defendants’ willful, malicious, wanton and fraudulent misconduct, in an amount according to proof at </w:t>
-      </w:r>
-      <w:proofErr w:type="gramStart"/>
-      <w:r>
-        <w:rPr>
-          <w:szCs w:val="24"/>
-        </w:rPr>
-        <w:t>trial;</w:t>
-      </w:r>
-      <w:proofErr w:type="gramEnd"/>
+        <w:t>For punitive and exemplary damages based on Defendants’ willful, malicious, wanton and fraudulent misconduct, in an amount according to proof at trial;</w:t>
+      </w:r>
     </w:p>
     <w:p>
       <w:pPr>
@@ -16567,15 +16245,7 @@
           <w:i/>
           <w:szCs w:val="24"/>
         </w:rPr>
-        <w:t xml:space="preserve">et. </w:t>
-      </w:r>
-      <w:proofErr w:type="gramStart"/>
-      <w:r>
-        <w:rPr>
-          <w:i/>
-          <w:szCs w:val="24"/>
-        </w:rPr>
-        <w:t>seq.</w:t>
+        <w:t>et. seq.</w:t>
       </w:r>
       <w:r>
         <w:rPr>
@@ -16583,7 +16253,6 @@
         </w:rPr>
         <w:t>;</w:t>
       </w:r>
-      <w:proofErr w:type="gramEnd"/>
     </w:p>
     <w:p>
       <w:pPr>
@@ -16637,16 +16306,8 @@
         <w:rPr>
           <w:szCs w:val="24"/>
         </w:rPr>
-        <w:t xml:space="preserve"> 3288 and </w:t>
-      </w:r>
-      <w:proofErr w:type="gramStart"/>
-      <w:r>
-        <w:rPr>
-          <w:szCs w:val="24"/>
-        </w:rPr>
-        <w:t>3291;</w:t>
-      </w:r>
-      <w:proofErr w:type="gramEnd"/>
+        <w:t xml:space="preserve"> 3288 and 3291;</w:t>
+      </w:r>
     </w:p>
     <w:p>
       <w:pPr>
@@ -16694,21 +16355,7 @@
         <w:rPr>
           <w:szCs w:val="24"/>
         </w:rPr>
-        <w:t xml:space="preserve"> been forced to incur in filing and prosecuting this </w:t>
-      </w:r>
-      <w:proofErr w:type="gramStart"/>
-      <w:r>
-        <w:rPr>
-          <w:szCs w:val="24"/>
-        </w:rPr>
-        <w:t>suit;</w:t>
-      </w:r>
-      <w:proofErr w:type="gramEnd"/>
-      <w:r>
-        <w:rPr>
-          <w:szCs w:val="24"/>
-        </w:rPr>
-        <w:t xml:space="preserve"> </w:t>
+        <w:t xml:space="preserve"> been forced to incur in filing and prosecuting this suit; </w:t>
       </w:r>
     </w:p>
     <w:p>
@@ -16727,16 +16374,8 @@
         <w:rPr>
           <w:szCs w:val="24"/>
         </w:rPr>
-        <w:t xml:space="preserve">For costs of suit incurred </w:t>
-      </w:r>
-      <w:proofErr w:type="gramStart"/>
-      <w:r>
-        <w:rPr>
-          <w:szCs w:val="24"/>
-        </w:rPr>
-        <w:t>herein;</w:t>
-      </w:r>
-      <w:proofErr w:type="gramEnd"/>
+        <w:t>For costs of suit incurred herein;</w:t>
+      </w:r>
     </w:p>
     <w:p>
       <w:pPr>
@@ -16766,16 +16405,8 @@
         <w:rPr>
           <w:szCs w:val="24"/>
         </w:rPr>
-        <w:t xml:space="preserve">time of </w:t>
-      </w:r>
-      <w:proofErr w:type="gramStart"/>
-      <w:r>
-        <w:rPr>
-          <w:szCs w:val="24"/>
-        </w:rPr>
-        <w:t>trial;</w:t>
-      </w:r>
-      <w:proofErr w:type="gramEnd"/>
+        <w:t>time of trial;</w:t>
+      </w:r>
     </w:p>
     <w:p>
       <w:pPr>
@@ -16793,21 +16424,7 @@
         <w:rPr>
           <w:szCs w:val="24"/>
         </w:rPr>
-        <w:t xml:space="preserve">Disgorgement of ill-gotten </w:t>
-      </w:r>
-      <w:proofErr w:type="gramStart"/>
-      <w:r>
-        <w:rPr>
-          <w:szCs w:val="24"/>
-        </w:rPr>
-        <w:t>gains;</w:t>
-      </w:r>
-      <w:proofErr w:type="gramEnd"/>
-      <w:r>
-        <w:rPr>
-          <w:szCs w:val="24"/>
-        </w:rPr>
-        <w:t xml:space="preserve"> </w:t>
+        <w:t xml:space="preserve">Disgorgement of ill-gotten gains; </w:t>
       </w:r>
     </w:p>
     <w:p>
@@ -16910,17 +16527,7 @@
           <w:sz w:val="24"/>
           <w:szCs w:val="24"/>
         </w:rPr>
-        <w:t xml:space="preserve">Dated this </w:t>
-      </w:r>
-      <w:r>
-        <w:rPr>
-          <w:rFonts w:ascii="Times New Roman" w:hAnsi="Times New Roman"/>
-          <w:b/>
-          <w:color w:val="000000" w:themeColor="text1"/>
-          <w:sz w:val="24"/>
-          <w:szCs w:val="24"/>
-        </w:rPr>
-        <w:t>&lt;Date&gt;</w:t>
+        <w:t>Dated this</w:t>
       </w:r>
       <w:r>
         <w:rPr>
@@ -17192,36 +16799,6 @@
           <w:szCs w:val="24"/>
         </w:rPr>
         <w:t xml:space="preserve"> </w:t>
-      </w:r>
-      <w:r>
-        <w:rPr>
-          <w:rFonts w:ascii="Times New Roman" w:hAnsi="Times New Roman"/>
-          <w:b/>
-          <w:color w:val="000000" w:themeColor="text1"/>
-          <w:sz w:val="24"/>
-          <w:szCs w:val="24"/>
-        </w:rPr>
-        <w:t>&lt;Date&gt;</w:t>
-      </w:r>
-      <w:r>
-        <w:rPr>
-          <w:rFonts w:ascii="Times New Roman" w:hAnsi="Times New Roman"/>
-          <w:b/>
-          <w:color w:val="000000" w:themeColor="text1"/>
-          <w:sz w:val="24"/>
-          <w:szCs w:val="24"/>
-        </w:rPr>
-        <w:tab/>
-      </w:r>
-      <w:r>
-        <w:rPr>
-          <w:rFonts w:ascii="Times New Roman" w:hAnsi="Times New Roman"/>
-          <w:b/>
-          <w:color w:val="000000" w:themeColor="text1"/>
-          <w:sz w:val="24"/>
-          <w:szCs w:val="24"/>
-        </w:rPr>
-        <w:tab/>
       </w:r>
       <w:r>
         <w:rPr>
@@ -18322,7 +17899,7 @@
             </wp:anchor>
           </w:drawing>
         </mc:Choice>
-        <mc:Fallback xmlns:mo="http://schemas.microsoft.com/office/mac/office/2008/main" xmlns:mv="urn:schemas-microsoft-com:mac:vml" xmlns:a14="http://schemas.microsoft.com/office/drawing/2010/main" xmlns:a="http://schemas.openxmlformats.org/drawingml/2006/main">
+        <mc:Fallback xmlns:a="http://schemas.openxmlformats.org/drawingml/2006/main" xmlns:a14="http://schemas.microsoft.com/office/drawing/2010/main" xmlns:mv="urn:schemas-microsoft-com:mac:vml" xmlns:mo="http://schemas.microsoft.com/office/mac/office/2008/main">
           <w:pict w14:anchorId="21EEE677">
             <v:line id="RightBorder" style="position:absolute;z-index:251658240;visibility:visible;mso-wrap-style:square;mso-width-percent:0;mso-height-percent:0;mso-wrap-distance-left:114299emu;mso-wrap-distance-top:0;mso-wrap-distance-right:114299emu;mso-wrap-distance-bottom:0;mso-position-horizontal:absolute;mso-position-horizontal-relative:margin;mso-position-vertical:absolute;mso-position-vertical-relative:page;mso-width-percent:0;mso-height-percent:0;mso-width-relative:page;mso-height-relative:page" o:spid="_x0000_s1026" from="468pt,0" to="468pt,11in" w14:anchorId="30CF3CBA" o:gfxdata="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">
               <w10:wrap anchorx="margin" anchory="page"/>
@@ -18397,7 +17974,7 @@
             </wp:anchor>
           </w:drawing>
         </mc:Choice>
-        <mc:Fallback xmlns:mo="http://schemas.microsoft.com/office/mac/office/2008/main" xmlns:mv="urn:schemas-microsoft-com:mac:vml" xmlns:a14="http://schemas.microsoft.com/office/drawing/2010/main" xmlns:a="http://schemas.openxmlformats.org/drawingml/2006/main">
+        <mc:Fallback xmlns:a="http://schemas.openxmlformats.org/drawingml/2006/main" xmlns:a14="http://schemas.microsoft.com/office/drawing/2010/main" xmlns:mv="urn:schemas-microsoft-com:mac:vml" xmlns:mo="http://schemas.microsoft.com/office/mac/office/2008/main">
           <w:pict w14:anchorId="25CCB756">
             <v:line id="LeftBorder2" style="position:absolute;z-index:251657216;visibility:visible;mso-wrap-style:square;mso-width-percent:0;mso-height-percent:0;mso-wrap-distance-left:114299emu;mso-wrap-distance-top:0;mso-wrap-distance-right:114299emu;mso-wrap-distance-bottom:0;mso-position-horizontal:absolute;mso-position-horizontal-relative:margin;mso-position-vertical:absolute;mso-position-vertical-relative:page;mso-width-percent:0;mso-height-percent:0;mso-width-relative:page;mso-height-relative:page" o:spid="_x0000_s1026" from="-7.2pt,0" to="-7.2pt,11in" w14:anchorId="1B37F9FC" o:gfxdata="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">
               <w10:wrap anchorx="margin" anchory="page"/>
@@ -18472,7 +18049,7 @@
             </wp:anchor>
           </w:drawing>
         </mc:Choice>
-        <mc:Fallback xmlns:mo="http://schemas.microsoft.com/office/mac/office/2008/main" xmlns:mv="urn:schemas-microsoft-com:mac:vml" xmlns:a14="http://schemas.microsoft.com/office/drawing/2010/main" xmlns:a="http://schemas.openxmlformats.org/drawingml/2006/main">
+        <mc:Fallback xmlns:a="http://schemas.openxmlformats.org/drawingml/2006/main" xmlns:a14="http://schemas.microsoft.com/office/drawing/2010/main" xmlns:mv="urn:schemas-microsoft-com:mac:vml" xmlns:mo="http://schemas.microsoft.com/office/mac/office/2008/main">
           <w:pict w14:anchorId="06B6C051">
             <v:line id="LeftBorder1" style="position:absolute;z-index:251656192;visibility:visible;mso-wrap-style:square;mso-width-percent:0;mso-height-percent:0;mso-wrap-distance-left:114299emu;mso-wrap-distance-top:0;mso-wrap-distance-right:114299emu;mso-wrap-distance-bottom:0;mso-position-horizontal:absolute;mso-position-horizontal-relative:margin;mso-position-vertical:absolute;mso-position-vertical-relative:page;mso-width-percent:0;mso-height-percent:0;mso-width-relative:page;mso-height-relative:page" o:spid="_x0000_s1026" from="-3.6pt,0" to="-3.6pt,11in" w14:anchorId="60EEB86F" o:gfxdata="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">
               <w10:wrap anchorx="margin" anchory="page"/>
@@ -22748,6 +22325,146 @@
 </file>
 
 <file path=customXml/item1.xml><?xml version="1.0" encoding="utf-8"?>
+<?mso-contentType ?>
+<FormTemplates xmlns="http://schemas.microsoft.com/sharepoint/v3/contenttype/forms">
+  <Display>DocumentLibraryForm</Display>
+  <Edit>AssetEditForm</Edit>
+  <New>DocumentLibraryForm</New>
+</FormTemplates>
+</file>
+
+<file path=customXml/item2.xml><?xml version="1.0" encoding="utf-8"?>
+<p:properties xmlns:p="http://schemas.microsoft.com/office/2006/metadata/properties" xmlns:xsi="http://www.w3.org/2001/XMLSchema-instance" xmlns:pc="http://schemas.microsoft.com/office/infopath/2007/PartnerControls">
+  <documentManagement>
+    <APDescription xmlns="4873beb7-5857-4685-be1f-d57550cc96cc" xsi:nil="true"/>
+    <AssetExpire xmlns="4873beb7-5857-4685-be1f-d57550cc96cc">2035-01-01T08:00:00+00:00</AssetExpire>
+    <CampaignTagsTaxHTField0 xmlns="4873beb7-5857-4685-be1f-d57550cc96cc">
+      <Terms xmlns="http://schemas.microsoft.com/office/infopath/2007/PartnerControls"/>
+    </CampaignTagsTaxHTField0>
+    <IntlLangReviewDate xmlns="4873beb7-5857-4685-be1f-d57550cc96cc" xsi:nil="true"/>
+    <TPFriendlyName xmlns="4873beb7-5857-4685-be1f-d57550cc96cc" xsi:nil="true"/>
+    <IntlLangReview xmlns="4873beb7-5857-4685-be1f-d57550cc96cc">false</IntlLangReview>
+    <LocLastLocAttemptVersionLookup xmlns="4873beb7-5857-4685-be1f-d57550cc96cc">752697</LocLastLocAttemptVersionLookup>
+    <PolicheckWords xmlns="4873beb7-5857-4685-be1f-d57550cc96cc" xsi:nil="true"/>
+    <SubmitterId xmlns="4873beb7-5857-4685-be1f-d57550cc96cc" xsi:nil="true"/>
+    <AcquiredFrom xmlns="4873beb7-5857-4685-be1f-d57550cc96cc">Internal MS</AcquiredFrom>
+    <EditorialStatus xmlns="4873beb7-5857-4685-be1f-d57550cc96cc" xsi:nil="true"/>
+    <Markets xmlns="4873beb7-5857-4685-be1f-d57550cc96cc"/>
+    <OriginAsset xmlns="4873beb7-5857-4685-be1f-d57550cc96cc" xsi:nil="true"/>
+    <AssetStart xmlns="4873beb7-5857-4685-be1f-d57550cc96cc">2012-01-04T19:17:00+00:00</AssetStart>
+    <FriendlyTitle xmlns="4873beb7-5857-4685-be1f-d57550cc96cc" xsi:nil="true"/>
+    <MarketSpecific xmlns="4873beb7-5857-4685-be1f-d57550cc96cc">false</MarketSpecific>
+    <TPNamespace xmlns="4873beb7-5857-4685-be1f-d57550cc96cc" xsi:nil="true"/>
+    <PublishStatusLookup xmlns="4873beb7-5857-4685-be1f-d57550cc96cc">
+      <Value>1422980</Value>
+      <Value>1526467</Value>
+    </PublishStatusLookup>
+    <APAuthor xmlns="4873beb7-5857-4685-be1f-d57550cc96cc">
+      <UserInfo>
+        <DisplayName>REDMOND\v-gehous</DisplayName>
+        <AccountId>2365</AccountId>
+        <AccountType/>
+      </UserInfo>
+    </APAuthor>
+    <TPCommandLine xmlns="4873beb7-5857-4685-be1f-d57550cc96cc" xsi:nil="true"/>
+    <IntlLangReviewer xmlns="4873beb7-5857-4685-be1f-d57550cc96cc" xsi:nil="true"/>
+    <OpenTemplate xmlns="4873beb7-5857-4685-be1f-d57550cc96cc">true</OpenTemplate>
+    <CSXSubmissionDate xmlns="4873beb7-5857-4685-be1f-d57550cc96cc" xsi:nil="true"/>
+    <TaxCatchAll xmlns="4873beb7-5857-4685-be1f-d57550cc96cc"/>
+    <Manager xmlns="4873beb7-5857-4685-be1f-d57550cc96cc" xsi:nil="true"/>
+    <NumericId xmlns="4873beb7-5857-4685-be1f-d57550cc96cc" xsi:nil="true"/>
+    <ParentAssetId xmlns="4873beb7-5857-4685-be1f-d57550cc96cc" xsi:nil="true"/>
+    <OriginalSourceMarket xmlns="4873beb7-5857-4685-be1f-d57550cc96cc" xsi:nil="true"/>
+    <ApprovalStatus xmlns="4873beb7-5857-4685-be1f-d57550cc96cc">InProgress</ApprovalStatus>
+    <TPComponent xmlns="4873beb7-5857-4685-be1f-d57550cc96cc" xsi:nil="true"/>
+    <EditorialTags xmlns="4873beb7-5857-4685-be1f-d57550cc96cc" xsi:nil="true"/>
+    <TPExecutable xmlns="4873beb7-5857-4685-be1f-d57550cc96cc" xsi:nil="true"/>
+    <TPLaunchHelpLink xmlns="4873beb7-5857-4685-be1f-d57550cc96cc" xsi:nil="true"/>
+    <LocComments xmlns="4873beb7-5857-4685-be1f-d57550cc96cc" xsi:nil="true"/>
+    <LocRecommendedHandoff xmlns="4873beb7-5857-4685-be1f-d57550cc96cc" xsi:nil="true"/>
+    <SourceTitle xmlns="4873beb7-5857-4685-be1f-d57550cc96cc" xsi:nil="true"/>
+    <CSXUpdate xmlns="4873beb7-5857-4685-be1f-d57550cc96cc">false</CSXUpdate>
+    <IntlLocPriority xmlns="4873beb7-5857-4685-be1f-d57550cc96cc" xsi:nil="true"/>
+    <UAProjectedTotalWords xmlns="4873beb7-5857-4685-be1f-d57550cc96cc" xsi:nil="true"/>
+    <AssetType xmlns="4873beb7-5857-4685-be1f-d57550cc96cc">TP</AssetType>
+    <MachineTranslated xmlns="4873beb7-5857-4685-be1f-d57550cc96cc">false</MachineTranslated>
+    <OutputCachingOn xmlns="4873beb7-5857-4685-be1f-d57550cc96cc">false</OutputCachingOn>
+    <TemplateStatus xmlns="4873beb7-5857-4685-be1f-d57550cc96cc" xsi:nil="true"/>
+    <IsSearchable xmlns="4873beb7-5857-4685-be1f-d57550cc96cc">true</IsSearchable>
+    <ContentItem xmlns="4873beb7-5857-4685-be1f-d57550cc96cc" xsi:nil="true"/>
+    <HandoffToMSDN xmlns="4873beb7-5857-4685-be1f-d57550cc96cc" xsi:nil="true"/>
+    <ShowIn xmlns="4873beb7-5857-4685-be1f-d57550cc96cc">Show everywhere</ShowIn>
+    <ThumbnailAssetId xmlns="4873beb7-5857-4685-be1f-d57550cc96cc" xsi:nil="true"/>
+    <UALocComments xmlns="4873beb7-5857-4685-be1f-d57550cc96cc">2007 Template UpLeveling Do Not HandOff</UALocComments>
+    <UALocRecommendation xmlns="4873beb7-5857-4685-be1f-d57550cc96cc">Localize</UALocRecommendation>
+    <LastModifiedDateTime xmlns="4873beb7-5857-4685-be1f-d57550cc96cc" xsi:nil="true"/>
+    <LegacyData xmlns="4873beb7-5857-4685-be1f-d57550cc96cc" xsi:nil="true"/>
+    <LocManualTestRequired xmlns="4873beb7-5857-4685-be1f-d57550cc96cc">false</LocManualTestRequired>
+    <ClipArtFilename xmlns="4873beb7-5857-4685-be1f-d57550cc96cc" xsi:nil="true"/>
+    <TPApplication xmlns="4873beb7-5857-4685-be1f-d57550cc96cc" xsi:nil="true"/>
+    <CSXHash xmlns="4873beb7-5857-4685-be1f-d57550cc96cc" xsi:nil="true"/>
+    <DirectSourceMarket xmlns="4873beb7-5857-4685-be1f-d57550cc96cc" xsi:nil="true"/>
+    <PrimaryImageGen xmlns="4873beb7-5857-4685-be1f-d57550cc96cc">true</PrimaryImageGen>
+    <PlannedPubDate xmlns="4873beb7-5857-4685-be1f-d57550cc96cc" xsi:nil="true"/>
+    <CSXSubmissionMarket xmlns="4873beb7-5857-4685-be1f-d57550cc96cc" xsi:nil="true"/>
+    <Downloads xmlns="4873beb7-5857-4685-be1f-d57550cc96cc">0</Downloads>
+    <ArtSampleDocs xmlns="4873beb7-5857-4685-be1f-d57550cc96cc" xsi:nil="true"/>
+    <TrustLevel xmlns="4873beb7-5857-4685-be1f-d57550cc96cc">1 Microsoft Managed Content</TrustLevel>
+    <BlockPublish xmlns="4873beb7-5857-4685-be1f-d57550cc96cc">false</BlockPublish>
+    <TPLaunchHelpLinkType xmlns="4873beb7-5857-4685-be1f-d57550cc96cc">Template</TPLaunchHelpLinkType>
+    <LocalizationTagsTaxHTField0 xmlns="4873beb7-5857-4685-be1f-d57550cc96cc">
+      <Terms xmlns="http://schemas.microsoft.com/office/infopath/2007/PartnerControls"/>
+    </LocalizationTagsTaxHTField0>
+    <BusinessGroup xmlns="4873beb7-5857-4685-be1f-d57550cc96cc" xsi:nil="true"/>
+    <Providers xmlns="4873beb7-5857-4685-be1f-d57550cc96cc" xsi:nil="true"/>
+    <TemplateTemplateType xmlns="4873beb7-5857-4685-be1f-d57550cc96cc">Word 2007 Default</TemplateTemplateType>
+    <TimesCloned xmlns="4873beb7-5857-4685-be1f-d57550cc96cc" xsi:nil="true"/>
+    <TPAppVersion xmlns="4873beb7-5857-4685-be1f-d57550cc96cc" xsi:nil="true"/>
+    <VoteCount xmlns="4873beb7-5857-4685-be1f-d57550cc96cc" xsi:nil="true"/>
+    <AverageRating xmlns="4873beb7-5857-4685-be1f-d57550cc96cc" xsi:nil="true"/>
+    <FeatureTagsTaxHTField0 xmlns="4873beb7-5857-4685-be1f-d57550cc96cc">
+      <Terms xmlns="http://schemas.microsoft.com/office/infopath/2007/PartnerControls"/>
+    </FeatureTagsTaxHTField0>
+    <Provider xmlns="4873beb7-5857-4685-be1f-d57550cc96cc" xsi:nil="true"/>
+    <UACurrentWords xmlns="4873beb7-5857-4685-be1f-d57550cc96cc" xsi:nil="true"/>
+    <AssetId xmlns="4873beb7-5857-4685-be1f-d57550cc96cc">TP102810049</AssetId>
+    <TPClientViewer xmlns="4873beb7-5857-4685-be1f-d57550cc96cc" xsi:nil="true"/>
+    <DSATActionTaken xmlns="4873beb7-5857-4685-be1f-d57550cc96cc" xsi:nil="true"/>
+    <APEditor xmlns="4873beb7-5857-4685-be1f-d57550cc96cc">
+      <UserInfo>
+        <DisplayName/>
+        <AccountId xsi:nil="true"/>
+        <AccountType/>
+      </UserInfo>
+    </APEditor>
+    <TPInstallLocation xmlns="4873beb7-5857-4685-be1f-d57550cc96cc" xsi:nil="true"/>
+    <OOCacheId xmlns="4873beb7-5857-4685-be1f-d57550cc96cc" xsi:nil="true"/>
+    <IsDeleted xmlns="4873beb7-5857-4685-be1f-d57550cc96cc">false</IsDeleted>
+    <PublishTargets xmlns="4873beb7-5857-4685-be1f-d57550cc96cc">OfficeOnlineVNext,OfficeOnline</PublishTargets>
+    <ApprovalLog xmlns="4873beb7-5857-4685-be1f-d57550cc96cc" xsi:nil="true"/>
+    <BugNumber xmlns="4873beb7-5857-4685-be1f-d57550cc96cc" xsi:nil="true"/>
+    <CrawlForDependencies xmlns="4873beb7-5857-4685-be1f-d57550cc96cc">false</CrawlForDependencies>
+    <InternalTagsTaxHTField0 xmlns="4873beb7-5857-4685-be1f-d57550cc96cc">
+      <Terms xmlns="http://schemas.microsoft.com/office/infopath/2007/PartnerControls"/>
+    </InternalTagsTaxHTField0>
+    <LastHandOff xmlns="4873beb7-5857-4685-be1f-d57550cc96cc" xsi:nil="true"/>
+    <Milestone xmlns="4873beb7-5857-4685-be1f-d57550cc96cc" xsi:nil="true"/>
+    <OriginalRelease xmlns="4873beb7-5857-4685-be1f-d57550cc96cc">14</OriginalRelease>
+    <RecommendationsModifier xmlns="4873beb7-5857-4685-be1f-d57550cc96cc" xsi:nil="true"/>
+    <ScenarioTagsTaxHTField0 xmlns="4873beb7-5857-4685-be1f-d57550cc96cc">
+      <Terms xmlns="http://schemas.microsoft.com/office/infopath/2007/PartnerControls"/>
+    </ScenarioTagsTaxHTField0>
+    <UANotes xmlns="4873beb7-5857-4685-be1f-d57550cc96cc" xsi:nil="true"/>
+    <LocMarketGroupTiers2 xmlns="4873beb7-5857-4685-be1f-d57550cc96cc">,t:Tier 1,t:Tier 2,t:Tier 3,</LocMarketGroupTiers2>
+  </documentManagement>
+</p:properties>
+</file>
+
+<file path=customXml/item3.xml><?xml version="1.0" encoding="utf-8"?>
+<b:Sources xmlns:b="http://schemas.openxmlformats.org/officeDocument/2006/bibliography" xmlns="http://schemas.openxmlformats.org/officeDocument/2006/bibliography" SelectedStyle="\APASixthEditionOfficeOnline.xsl" StyleName="APA" Version="6"/>
+</file>
+
+<file path=customXml/item4.xml><?xml version="1.0" encoding="utf-8"?>
 <ct:contentTypeSchema xmlns:ct="http://schemas.microsoft.com/office/2006/metadata/contentType" xmlns:ma="http://schemas.microsoft.com/office/2006/metadata/properties/metaAttributes" ct:_="" ma:_="" ma:contentTypeName="TemplateFile" ma:contentTypeID="0x0101006EDDDB5EE6D98C44930B742096920B300400F5B6D36B3EF94B4E9A635CDF2A18F5B8" ma:contentTypeVersion="72" ma:contentTypeDescription="Create a new document." ma:contentTypeScope="" ma:versionID="a23e56308344d904b51738559c3d67c9">
   <xsd:schema xmlns:xsd="http://www.w3.org/2001/XMLSchema" xmlns:xs="http://www.w3.org/2001/XMLSchema" xmlns:p="http://schemas.microsoft.com/office/2006/metadata/properties" xmlns:ns2="4873beb7-5857-4685-be1f-d57550cc96cc" targetNamespace="http://schemas.microsoft.com/office/2006/metadata/properties" ma:root="true" ma:fieldsID="cd0908cc4600e77bf5da051303e00c8d" ns2:_="">
     <xsd:import namespace="4873beb7-5857-4685-be1f-d57550cc96cc"/>
@@ -23787,147 +23504,33 @@
 </ct:contentTypeSchema>
 </file>
 
-<file path=customXml/item2.xml><?xml version="1.0" encoding="utf-8"?>
-<b:Sources xmlns:b="http://schemas.openxmlformats.org/officeDocument/2006/bibliography" xmlns="http://schemas.openxmlformats.org/officeDocument/2006/bibliography" SelectedStyle="\APASixthEditionOfficeOnline.xsl" StyleName="APA" Version="6"/>
+<file path=customXml/itemProps1.xml><?xml version="1.0" encoding="utf-8"?>
+<ds:datastoreItem xmlns:ds="http://schemas.openxmlformats.org/officeDocument/2006/customXml" ds:itemID="{6DFD6874-8625-466B-B71B-2B032C1BE3E9}">
+  <ds:schemaRefs>
+    <ds:schemaRef ds:uri="http://schemas.microsoft.com/sharepoint/v3/contenttype/forms"/>
+  </ds:schemaRefs>
+</ds:datastoreItem>
 </file>
 
-<file path=customXml/item3.xml><?xml version="1.0" encoding="utf-8"?>
-<p:properties xmlns:p="http://schemas.microsoft.com/office/2006/metadata/properties" xmlns:xsi="http://www.w3.org/2001/XMLSchema-instance" xmlns:pc="http://schemas.microsoft.com/office/infopath/2007/PartnerControls">
-  <documentManagement>
-    <APDescription xmlns="4873beb7-5857-4685-be1f-d57550cc96cc" xsi:nil="true"/>
-    <AssetExpire xmlns="4873beb7-5857-4685-be1f-d57550cc96cc">2035-01-01T08:00:00+00:00</AssetExpire>
-    <CampaignTagsTaxHTField0 xmlns="4873beb7-5857-4685-be1f-d57550cc96cc">
-      <Terms xmlns="http://schemas.microsoft.com/office/infopath/2007/PartnerControls"/>
-    </CampaignTagsTaxHTField0>
-    <IntlLangReviewDate xmlns="4873beb7-5857-4685-be1f-d57550cc96cc" xsi:nil="true"/>
-    <TPFriendlyName xmlns="4873beb7-5857-4685-be1f-d57550cc96cc" xsi:nil="true"/>
-    <IntlLangReview xmlns="4873beb7-5857-4685-be1f-d57550cc96cc">false</IntlLangReview>
-    <LocLastLocAttemptVersionLookup xmlns="4873beb7-5857-4685-be1f-d57550cc96cc">752697</LocLastLocAttemptVersionLookup>
-    <PolicheckWords xmlns="4873beb7-5857-4685-be1f-d57550cc96cc" xsi:nil="true"/>
-    <SubmitterId xmlns="4873beb7-5857-4685-be1f-d57550cc96cc" xsi:nil="true"/>
-    <AcquiredFrom xmlns="4873beb7-5857-4685-be1f-d57550cc96cc">Internal MS</AcquiredFrom>
-    <EditorialStatus xmlns="4873beb7-5857-4685-be1f-d57550cc96cc" xsi:nil="true"/>
-    <Markets xmlns="4873beb7-5857-4685-be1f-d57550cc96cc"/>
-    <OriginAsset xmlns="4873beb7-5857-4685-be1f-d57550cc96cc" xsi:nil="true"/>
-    <AssetStart xmlns="4873beb7-5857-4685-be1f-d57550cc96cc">2012-01-04T19:17:00+00:00</AssetStart>
-    <FriendlyTitle xmlns="4873beb7-5857-4685-be1f-d57550cc96cc" xsi:nil="true"/>
-    <MarketSpecific xmlns="4873beb7-5857-4685-be1f-d57550cc96cc">false</MarketSpecific>
-    <TPNamespace xmlns="4873beb7-5857-4685-be1f-d57550cc96cc" xsi:nil="true"/>
-    <PublishStatusLookup xmlns="4873beb7-5857-4685-be1f-d57550cc96cc">
-      <Value>1422980</Value>
-      <Value>1526467</Value>
-    </PublishStatusLookup>
-    <APAuthor xmlns="4873beb7-5857-4685-be1f-d57550cc96cc">
-      <UserInfo>
-        <DisplayName>REDMOND\v-gehous</DisplayName>
-        <AccountId>2365</AccountId>
-        <AccountType/>
-      </UserInfo>
-    </APAuthor>
-    <TPCommandLine xmlns="4873beb7-5857-4685-be1f-d57550cc96cc" xsi:nil="true"/>
-    <IntlLangReviewer xmlns="4873beb7-5857-4685-be1f-d57550cc96cc" xsi:nil="true"/>
-    <OpenTemplate xmlns="4873beb7-5857-4685-be1f-d57550cc96cc">true</OpenTemplate>
-    <CSXSubmissionDate xmlns="4873beb7-5857-4685-be1f-d57550cc96cc" xsi:nil="true"/>
-    <TaxCatchAll xmlns="4873beb7-5857-4685-be1f-d57550cc96cc"/>
-    <Manager xmlns="4873beb7-5857-4685-be1f-d57550cc96cc" xsi:nil="true"/>
-    <NumericId xmlns="4873beb7-5857-4685-be1f-d57550cc96cc" xsi:nil="true"/>
-    <ParentAssetId xmlns="4873beb7-5857-4685-be1f-d57550cc96cc" xsi:nil="true"/>
-    <OriginalSourceMarket xmlns="4873beb7-5857-4685-be1f-d57550cc96cc" xsi:nil="true"/>
-    <ApprovalStatus xmlns="4873beb7-5857-4685-be1f-d57550cc96cc">InProgress</ApprovalStatus>
-    <TPComponent xmlns="4873beb7-5857-4685-be1f-d57550cc96cc" xsi:nil="true"/>
-    <EditorialTags xmlns="4873beb7-5857-4685-be1f-d57550cc96cc" xsi:nil="true"/>
-    <TPExecutable xmlns="4873beb7-5857-4685-be1f-d57550cc96cc" xsi:nil="true"/>
-    <TPLaunchHelpLink xmlns="4873beb7-5857-4685-be1f-d57550cc96cc" xsi:nil="true"/>
-    <LocComments xmlns="4873beb7-5857-4685-be1f-d57550cc96cc" xsi:nil="true"/>
-    <LocRecommendedHandoff xmlns="4873beb7-5857-4685-be1f-d57550cc96cc" xsi:nil="true"/>
-    <SourceTitle xmlns="4873beb7-5857-4685-be1f-d57550cc96cc" xsi:nil="true"/>
-    <CSXUpdate xmlns="4873beb7-5857-4685-be1f-d57550cc96cc">false</CSXUpdate>
-    <IntlLocPriority xmlns="4873beb7-5857-4685-be1f-d57550cc96cc" xsi:nil="true"/>
-    <UAProjectedTotalWords xmlns="4873beb7-5857-4685-be1f-d57550cc96cc" xsi:nil="true"/>
-    <AssetType xmlns="4873beb7-5857-4685-be1f-d57550cc96cc">TP</AssetType>
-    <MachineTranslated xmlns="4873beb7-5857-4685-be1f-d57550cc96cc">false</MachineTranslated>
-    <OutputCachingOn xmlns="4873beb7-5857-4685-be1f-d57550cc96cc">false</OutputCachingOn>
-    <TemplateStatus xmlns="4873beb7-5857-4685-be1f-d57550cc96cc" xsi:nil="true"/>
-    <IsSearchable xmlns="4873beb7-5857-4685-be1f-d57550cc96cc">true</IsSearchable>
-    <ContentItem xmlns="4873beb7-5857-4685-be1f-d57550cc96cc" xsi:nil="true"/>
-    <HandoffToMSDN xmlns="4873beb7-5857-4685-be1f-d57550cc96cc" xsi:nil="true"/>
-    <ShowIn xmlns="4873beb7-5857-4685-be1f-d57550cc96cc">Show everywhere</ShowIn>
-    <ThumbnailAssetId xmlns="4873beb7-5857-4685-be1f-d57550cc96cc" xsi:nil="true"/>
-    <UALocComments xmlns="4873beb7-5857-4685-be1f-d57550cc96cc">2007 Template UpLeveling Do Not HandOff</UALocComments>
-    <UALocRecommendation xmlns="4873beb7-5857-4685-be1f-d57550cc96cc">Localize</UALocRecommendation>
-    <LastModifiedDateTime xmlns="4873beb7-5857-4685-be1f-d57550cc96cc" xsi:nil="true"/>
-    <LegacyData xmlns="4873beb7-5857-4685-be1f-d57550cc96cc" xsi:nil="true"/>
-    <LocManualTestRequired xmlns="4873beb7-5857-4685-be1f-d57550cc96cc">false</LocManualTestRequired>
-    <ClipArtFilename xmlns="4873beb7-5857-4685-be1f-d57550cc96cc" xsi:nil="true"/>
-    <TPApplication xmlns="4873beb7-5857-4685-be1f-d57550cc96cc" xsi:nil="true"/>
-    <CSXHash xmlns="4873beb7-5857-4685-be1f-d57550cc96cc" xsi:nil="true"/>
-    <DirectSourceMarket xmlns="4873beb7-5857-4685-be1f-d57550cc96cc" xsi:nil="true"/>
-    <PrimaryImageGen xmlns="4873beb7-5857-4685-be1f-d57550cc96cc">true</PrimaryImageGen>
-    <PlannedPubDate xmlns="4873beb7-5857-4685-be1f-d57550cc96cc" xsi:nil="true"/>
-    <CSXSubmissionMarket xmlns="4873beb7-5857-4685-be1f-d57550cc96cc" xsi:nil="true"/>
-    <Downloads xmlns="4873beb7-5857-4685-be1f-d57550cc96cc">0</Downloads>
-    <ArtSampleDocs xmlns="4873beb7-5857-4685-be1f-d57550cc96cc" xsi:nil="true"/>
-    <TrustLevel xmlns="4873beb7-5857-4685-be1f-d57550cc96cc">1 Microsoft Managed Content</TrustLevel>
-    <BlockPublish xmlns="4873beb7-5857-4685-be1f-d57550cc96cc">false</BlockPublish>
-    <TPLaunchHelpLinkType xmlns="4873beb7-5857-4685-be1f-d57550cc96cc">Template</TPLaunchHelpLinkType>
-    <LocalizationTagsTaxHTField0 xmlns="4873beb7-5857-4685-be1f-d57550cc96cc">
-      <Terms xmlns="http://schemas.microsoft.com/office/infopath/2007/PartnerControls"/>
-    </LocalizationTagsTaxHTField0>
-    <BusinessGroup xmlns="4873beb7-5857-4685-be1f-d57550cc96cc" xsi:nil="true"/>
-    <Providers xmlns="4873beb7-5857-4685-be1f-d57550cc96cc" xsi:nil="true"/>
-    <TemplateTemplateType xmlns="4873beb7-5857-4685-be1f-d57550cc96cc">Word 2007 Default</TemplateTemplateType>
-    <TimesCloned xmlns="4873beb7-5857-4685-be1f-d57550cc96cc" xsi:nil="true"/>
-    <TPAppVersion xmlns="4873beb7-5857-4685-be1f-d57550cc96cc" xsi:nil="true"/>
-    <VoteCount xmlns="4873beb7-5857-4685-be1f-d57550cc96cc" xsi:nil="true"/>
-    <AverageRating xmlns="4873beb7-5857-4685-be1f-d57550cc96cc" xsi:nil="true"/>
-    <FeatureTagsTaxHTField0 xmlns="4873beb7-5857-4685-be1f-d57550cc96cc">
-      <Terms xmlns="http://schemas.microsoft.com/office/infopath/2007/PartnerControls"/>
-    </FeatureTagsTaxHTField0>
-    <Provider xmlns="4873beb7-5857-4685-be1f-d57550cc96cc" xsi:nil="true"/>
-    <UACurrentWords xmlns="4873beb7-5857-4685-be1f-d57550cc96cc" xsi:nil="true"/>
-    <AssetId xmlns="4873beb7-5857-4685-be1f-d57550cc96cc">TP102810049</AssetId>
-    <TPClientViewer xmlns="4873beb7-5857-4685-be1f-d57550cc96cc" xsi:nil="true"/>
-    <DSATActionTaken xmlns="4873beb7-5857-4685-be1f-d57550cc96cc" xsi:nil="true"/>
-    <APEditor xmlns="4873beb7-5857-4685-be1f-d57550cc96cc">
-      <UserInfo>
-        <DisplayName/>
-        <AccountId xsi:nil="true"/>
-        <AccountType/>
-      </UserInfo>
-    </APEditor>
-    <TPInstallLocation xmlns="4873beb7-5857-4685-be1f-d57550cc96cc" xsi:nil="true"/>
-    <OOCacheId xmlns="4873beb7-5857-4685-be1f-d57550cc96cc" xsi:nil="true"/>
-    <IsDeleted xmlns="4873beb7-5857-4685-be1f-d57550cc96cc">false</IsDeleted>
-    <PublishTargets xmlns="4873beb7-5857-4685-be1f-d57550cc96cc">OfficeOnlineVNext,OfficeOnline</PublishTargets>
-    <ApprovalLog xmlns="4873beb7-5857-4685-be1f-d57550cc96cc" xsi:nil="true"/>
-    <BugNumber xmlns="4873beb7-5857-4685-be1f-d57550cc96cc" xsi:nil="true"/>
-    <CrawlForDependencies xmlns="4873beb7-5857-4685-be1f-d57550cc96cc">false</CrawlForDependencies>
-    <InternalTagsTaxHTField0 xmlns="4873beb7-5857-4685-be1f-d57550cc96cc">
-      <Terms xmlns="http://schemas.microsoft.com/office/infopath/2007/PartnerControls"/>
-    </InternalTagsTaxHTField0>
-    <LastHandOff xmlns="4873beb7-5857-4685-be1f-d57550cc96cc" xsi:nil="true"/>
-    <Milestone xmlns="4873beb7-5857-4685-be1f-d57550cc96cc" xsi:nil="true"/>
-    <OriginalRelease xmlns="4873beb7-5857-4685-be1f-d57550cc96cc">14</OriginalRelease>
-    <RecommendationsModifier xmlns="4873beb7-5857-4685-be1f-d57550cc96cc" xsi:nil="true"/>
-    <ScenarioTagsTaxHTField0 xmlns="4873beb7-5857-4685-be1f-d57550cc96cc">
-      <Terms xmlns="http://schemas.microsoft.com/office/infopath/2007/PartnerControls"/>
-    </ScenarioTagsTaxHTField0>
-    <UANotes xmlns="4873beb7-5857-4685-be1f-d57550cc96cc" xsi:nil="true"/>
-    <LocMarketGroupTiers2 xmlns="4873beb7-5857-4685-be1f-d57550cc96cc">,t:Tier 1,t:Tier 2,t:Tier 3,</LocMarketGroupTiers2>
-  </documentManagement>
-</p:properties>
+<file path=customXml/itemProps2.xml><?xml version="1.0" encoding="utf-8"?>
+<ds:datastoreItem xmlns:ds="http://schemas.openxmlformats.org/officeDocument/2006/customXml" ds:itemID="{4D03386A-0ED0-4998-85A1-A0A863BDA4FB}">
+  <ds:schemaRefs>
+    <ds:schemaRef ds:uri="http://schemas.microsoft.com/office/2006/metadata/properties"/>
+    <ds:schemaRef ds:uri="http://schemas.microsoft.com/office/infopath/2007/PartnerControls"/>
+    <ds:schemaRef ds:uri="4873beb7-5857-4685-be1f-d57550cc96cc"/>
+  </ds:schemaRefs>
+</ds:datastoreItem>
 </file>
 
-<file path=customXml/item4.xml><?xml version="1.0" encoding="utf-8"?>
-<?mso-contentType ?>
-<FormTemplates xmlns="http://schemas.microsoft.com/sharepoint/v3/contenttype/forms">
-  <Display>DocumentLibraryForm</Display>
-  <Edit>AssetEditForm</Edit>
-  <New>DocumentLibraryForm</New>
-</FormTemplates>
+<file path=customXml/itemProps3.xml><?xml version="1.0" encoding="utf-8"?>
+<ds:datastoreItem xmlns:ds="http://schemas.openxmlformats.org/officeDocument/2006/customXml" ds:itemID="{EA486109-08B2-E843-A1A0-812077317A8E}">
+  <ds:schemaRefs>
+    <ds:schemaRef ds:uri="http://schemas.openxmlformats.org/officeDocument/2006/bibliography"/>
+  </ds:schemaRefs>
+</ds:datastoreItem>
 </file>
 
-<file path=customXml/itemProps1.xml><?xml version="1.0" encoding="utf-8"?>
+<file path=customXml/itemProps4.xml><?xml version="1.0" encoding="utf-8"?>
 <ds:datastoreItem xmlns:ds="http://schemas.openxmlformats.org/officeDocument/2006/customXml" ds:itemID="{443875C6-06B4-474E-8EEF-2F17FA9EA70E}">
   <ds:schemaRefs>
     <ds:schemaRef ds:uri="http://schemas.microsoft.com/office/2006/metadata/contentType"/>
@@ -23943,30 +23546,4 @@
     <ds:schemaRef ds:uri="http://schemas.microsoft.com/internal/obd"/>
   </ds:schemaRefs>
 </ds:datastoreItem>
-</file>
-
-<file path=customXml/itemProps2.xml><?xml version="1.0" encoding="utf-8"?>
-<ds:datastoreItem xmlns:ds="http://schemas.openxmlformats.org/officeDocument/2006/customXml" ds:itemID="{EA486109-08B2-E843-A1A0-812077317A8E}">
-  <ds:schemaRefs>
-    <ds:schemaRef ds:uri="http://schemas.openxmlformats.org/officeDocument/2006/bibliography"/>
-  </ds:schemaRefs>
-</ds:datastoreItem>
-</file>
-
-<file path=customXml/itemProps3.xml><?xml version="1.0" encoding="utf-8"?>
-<ds:datastoreItem xmlns:ds="http://schemas.openxmlformats.org/officeDocument/2006/customXml" ds:itemID="{4D03386A-0ED0-4998-85A1-A0A863BDA4FB}">
-  <ds:schemaRefs>
-    <ds:schemaRef ds:uri="http://schemas.microsoft.com/office/2006/metadata/properties"/>
-    <ds:schemaRef ds:uri="http://schemas.microsoft.com/office/infopath/2007/PartnerControls"/>
-    <ds:schemaRef ds:uri="4873beb7-5857-4685-be1f-d57550cc96cc"/>
-  </ds:schemaRefs>
-</ds:datastoreItem>
-</file>
-
-<file path=customXml/itemProps4.xml><?xml version="1.0" encoding="utf-8"?>
-<ds:datastoreItem xmlns:ds="http://schemas.openxmlformats.org/officeDocument/2006/customXml" ds:itemID="{6DFD6874-8625-466B-B71B-2B032C1BE3E9}">
-  <ds:schemaRefs>
-    <ds:schemaRef ds:uri="http://schemas.microsoft.com/sharepoint/v3/contenttype/forms"/>
-  </ds:schemaRefs>
-</ds:datastoreItem>
 </file>
</xml_diff>